<commit_message>
corrected log errors; improved docs
</commit_message>
<xml_diff>
--- a/docs/installation/Install-Arelle-XBRL-validator.docx
+++ b/docs/installation/Install-Arelle-XBRL-validator.docx
@@ -216,7 +216,7 @@
       </w:pPr>
       <w:r>
         <w:rPr/>
-        <w:t xml:space="preserve">choose “Disclosure system checks”. </w:t>
+        <w:t>Select disclosure system: choose “US SEC (EDGAR Filing Manual Pragmatic)”.</w:t>
       </w:r>
     </w:p>
     <w:p>
@@ -231,7 +231,7 @@
       </w:pPr>
       <w:r>
         <w:rPr/>
-        <w:t>Select disclosure system: choose “US SEC (EDGAR Filing Manual Pragmatic)”.</w:t>
+        <w:t xml:space="preserve">choose “Disclosure system checks”. </w:t>
       </w:r>
     </w:p>
     <w:p>
@@ -246,7 +246,15 @@
       </w:pPr>
       <w:r>
         <w:rPr/>
-        <w:t>Base taxonomy validation: select “Use disclosure system settings”.</w:t>
+        <w:t>Base taxonomy validation: select “</w:t>
+      </w:r>
+      <w:r>
+        <w:rPr/>
+        <w:t>Don’t validate any base files</w:t>
+      </w:r>
+      <w:r>
+        <w:rPr/>
+        <w:t>”.</w:t>
       </w:r>
     </w:p>
     <w:p>
@@ -581,31 +589,7 @@
       </w:pPr>
       <w:r>
         <w:rPr/>
-        <w:t xml:space="preserve">After running the application, </w:t>
-      </w:r>
-      <w:r>
-        <w:rPr/>
-        <w:t>D</w:t>
-      </w:r>
-      <w:r>
-        <w:rPr/>
-        <w:t xml:space="preserve">isclosure </w:t>
-      </w:r>
-      <w:r>
-        <w:rPr/>
-        <w:t>P</w:t>
-      </w:r>
-      <w:r>
-        <w:rPr/>
-        <w:t xml:space="preserve">ilot </w:t>
-      </w:r>
-      <w:r>
-        <w:rPr/>
-        <w:t>AI</w:t>
-      </w:r>
-      <w:r>
-        <w:rPr/>
-        <w:t>, and saving the report files, Arelle may be used to view them.</w:t>
+        <w:t>After running the application, Disclosure Pilot AI, and saving the report files, Arelle may be used to view them.</w:t>
       </w:r>
     </w:p>
     <w:p>
@@ -1126,7 +1110,7 @@
     <w:pPr>
       <w:widowControl/>
       <w:suppressAutoHyphens w:val="true"/>
-      <w:overflowPunct w:val="true"/>
+      <w:overflowPunct w:val="false"/>
       <w:bidi w:val="0"/>
       <w:spacing w:before="0" w:after="0"/>
       <w:jc w:val="start"/>
@@ -1182,8 +1166,8 @@
       <w:iCs/>
     </w:rPr>
   </w:style>
-  <w:style w:type="character" w:styleId="Bullets">
-    <w:name w:val="Bullets"/>
+  <w:style w:type="character" w:styleId="Bulletsuser">
+    <w:name w:val="Bullets (user)"/>
     <w:qFormat/>
     <w:rPr>
       <w:rFonts w:ascii="OpenSymbol" w:hAnsi="OpenSymbol" w:eastAsia="OpenSymbol" w:cs="OpenSymbol"/>

</xml_diff>